<commit_message>
fix: stabilize conversational routing and learning feedback
</commit_message>
<xml_diff>
--- a/backend/competition/修改后的创新点.docx
+++ b/backend/competition/修改后的创新点.docx
@@ -1,6 +1,6 @@
 
 <file path=word/document.xml><?xml version="1.0" encoding="utf-8"?>
-<w:document xmlns:wpc="http://schemas.microsoft.com/office/word/2010/wordprocessingCanvas" xmlns:cx="http://schemas.microsoft.com/office/drawing/2014/chartex" xmlns:cx1="http://schemas.microsoft.com/office/drawing/2015/9/8/chartex" xmlns:cx2="http://schemas.microsoft.com/office/drawing/2015/10/21/chartex" xmlns:cx3="http://schemas.microsoft.com/office/drawing/2016/5/9/chartex" xmlns:cx4="http://schemas.microsoft.com/office/drawing/2016/5/10/chartex" xmlns:cx5="http://schemas.microsoft.com/office/drawing/2016/5/11/chartex" xmlns:cx6="http://schemas.microsoft.com/office/drawing/2016/5/12/chartex" xmlns:cx7="http://schemas.microsoft.com/office/drawing/2016/5/13/chartex" xmlns:cx8="http://schemas.microsoft.com/office/drawing/2016/5/14/chartex" xmlns:mc="http://schemas.openxmlformats.org/markup-compatibility/2006" xmlns:aink="http://schemas.microsoft.com/office/drawing/2016/ink" xmlns:am3d="http://schemas.microsoft.com/office/drawing/2017/model3d" xmlns:o="urn:schemas-microsoft-com:office:office" xmlns:oel="http://schemas.microsoft.com/office/2019/extlst" xmlns:r="http://schemas.openxmlformats.org/officeDocument/2006/relationships" xmlns:m="http://schemas.openxmlformats.org/officeDocument/2006/math" xmlns:v="urn:schemas-microsoft-com:vml" xmlns:wp14="http://schemas.microsoft.com/office/word/2010/wordprocessingDrawing" xmlns:wp="http://schemas.openxmlformats.org/drawingml/2006/wordprocessingDrawing" xmlns:w10="urn:schemas-microsoft-com:office:word" xmlns:w="http://schemas.openxmlformats.org/wordprocessingml/2006/main" xmlns:w14="http://schemas.microsoft.com/office/word/2010/wordml" xmlns:w15="http://schemas.microsoft.com/office/word/2012/wordml" xmlns:w16cex="http://schemas.microsoft.com/office/word/2018/wordml/cex" xmlns:w16cid="http://schemas.microsoft.com/office/word/2016/wordml/cid" xmlns:w16="http://schemas.microsoft.com/office/word/2018/wordml" xmlns:w16du="http://schemas.microsoft.com/office/word/2023/wordml/word16du" xmlns:w16sdtdh="http://schemas.microsoft.com/office/word/2020/wordml/sdtdatahash" xmlns:w16sdtfl="http://schemas.microsoft.com/office/word/2024/wordml/sdtformatlock" xmlns:w16se="http://schemas.microsoft.com/office/word/2015/wordml/symex" xmlns:wpg="http://schemas.microsoft.com/office/word/2010/wordprocessingGroup" xmlns:wpi="http://schemas.microsoft.com/office/word/2010/wordprocessingInk" xmlns:wne="http://schemas.microsoft.com/office/word/2006/wordml" xmlns:wps="http://schemas.microsoft.com/office/word/2010/wordprocessingShape" mc:Ignorable="w14 w15 w16se w16cid w16 w16cex w16sdtdh w16sdtfl w16du wp14">
+<w:document xmlns:wpc="http://schemas.microsoft.com/office/word/2010/wordprocessingCanvas" xmlns:cx="http://schemas.microsoft.com/office/drawing/2014/chartex" xmlns:cx1="http://schemas.microsoft.com/office/drawing/2015/9/8/chartex" xmlns:cx2="http://schemas.microsoft.com/office/drawing/2015/10/21/chartex" xmlns:cx3="http://schemas.microsoft.com/office/drawing/2016/5/9/chartex" xmlns:cx4="http://schemas.microsoft.com/office/drawing/2016/5/10/chartex" xmlns:cx5="http://schemas.microsoft.com/office/drawing/2016/5/11/chartex" xmlns:cx6="http://schemas.microsoft.com/office/drawing/2016/5/12/chartex" xmlns:cx7="http://schemas.microsoft.com/office/drawing/2016/5/13/chartex" xmlns:cx8="http://schemas.microsoft.com/office/drawing/2016/5/14/chartex" xmlns:mc="http://schemas.openxmlformats.org/markup-compatibility/2006" xmlns:aink="http://schemas.microsoft.com/office/drawing/2016/ink" xmlns:am3d="http://schemas.microsoft.com/office/drawing/2017/model3d" xmlns:o="urn:schemas-microsoft-com:office:office" xmlns:oel="http://schemas.microsoft.com/office/2019/extlst" xmlns:r="http://schemas.openxmlformats.org/officeDocument/2006/relationships" xmlns:m="http://schemas.openxmlformats.org/officeDocument/2006/math" xmlns:v="urn:schemas-microsoft-com:vml" xmlns:wp14="http://schemas.microsoft.com/office/word/2010/wordprocessingDrawing" xmlns:wp="http://schemas.openxmlformats.org/drawingml/2006/wordprocessingDrawing" xmlns:w10="urn:schemas-microsoft-com:office:word" xmlns:w="http://schemas.openxmlformats.org/wordprocessingml/2006/main" xmlns:w14="http://schemas.microsoft.com/office/word/2010/wordml" xmlns:w15="http://schemas.microsoft.com/office/word/2012/wordml" xmlns:w16cei="http://schemas.microsoft.com/office/word/2026/wordml/cei" xmlns:w16cex="http://schemas.microsoft.com/office/word/2018/wordml/cex" xmlns:w16cid="http://schemas.microsoft.com/office/word/2016/wordml/cid" xmlns:w16="http://schemas.microsoft.com/office/word/2018/wordml" xmlns:w16du="http://schemas.microsoft.com/office/word/2023/wordml/word16du" xmlns:w16sdtdh="http://schemas.microsoft.com/office/word/2020/wordml/sdtdatahash" xmlns:w16sdtfl="http://schemas.microsoft.com/office/word/2024/wordml/sdtformatlock" xmlns:w16se="http://schemas.microsoft.com/office/word/2015/wordml/symex" xmlns:wpg="http://schemas.microsoft.com/office/word/2010/wordprocessingGroup" xmlns:wpi="http://schemas.microsoft.com/office/word/2010/wordprocessingInk" xmlns:wne="http://schemas.microsoft.com/office/word/2006/wordml" xmlns:wps="http://schemas.microsoft.com/office/word/2010/wordprocessingShape" mc:Ignorable="w14 w15 w16se w16cid w16 w16cex w16sdtdh w16sdtfl w16du wp14">
   <w:body>
     <w:p>
       <w:pPr>
@@ -12,30 +12,40 @@
       </w:pPr>
       <w:r>
         <w:rPr>
-          <w:b/>
-          <w:bCs/>
-        </w:rPr>
-        <w:t>创新点一：可信、可追责的多智能体学习任务协同机制</w:t>
-      </w:r>
-    </w:p>
-    <w:p>
-      <w:pPr>
-        <w:rPr>
-          <w:rFonts w:hint="eastAsia"/>
-        </w:rPr>
-      </w:pPr>
-      <w:r>
-        <w:t>建议标题：</w:t>
-      </w:r>
-    </w:p>
-    <w:p>
-      <w:pPr>
-        <w:rPr>
-          <w:rFonts w:hint="eastAsia"/>
-        </w:rPr>
-      </w:pPr>
-      <w:r>
-        <w:rPr>
+          <w:rFonts w:cs="等线"/>
+          <w:b/>
+          <w:bCs/>
+        </w:rPr>
+        <w:t>创新点一：证据</w:t>
+      </w:r>
+      <w:r>
+        <w:rPr>
+          <w:rFonts w:ascii="Segoe WPC" w:cs="Segoe WPC"/>
+          <w:b/>
+          <w:bCs/>
+          <w:sz w:val="20"/>
+          <w:szCs w:val="20"/>
+        </w:rPr>
+        <w:t>约束与</w:t>
+      </w:r>
+      <w:r>
+        <w:rPr>
+          <w:rFonts w:cs="等线"/>
+          <w:b/>
+          <w:bCs/>
+        </w:rPr>
+        <w:t>可追责的多智能体学习任务协同机制（实验检验）</w:t>
+      </w:r>
+    </w:p>
+    <w:p>
+      <w:pPr>
+        <w:rPr>
+          <w:rFonts w:hint="eastAsia"/>
+        </w:rPr>
+      </w:pPr>
+      <w:r>
+        <w:rPr>
+          <w:rFonts w:cs="等线"/>
           <w:b/>
           <w:bCs/>
         </w:rPr>
@@ -49,125 +59,156 @@
         </w:rPr>
       </w:pPr>
       <w:r>
+        <w:rPr>
+          <w:rFonts w:cs="等线"/>
+        </w:rPr>
         <w:t>核心内容：</w:t>
       </w:r>
     </w:p>
     <w:p>
       <w:pPr>
-        <w:numPr>
-          <w:ilvl w:val="0"/>
-          <w:numId w:val="1"/>
-        </w:numPr>
-        <w:rPr>
-          <w:rFonts w:hint="eastAsia"/>
-        </w:rPr>
-      </w:pPr>
-      <w:r>
-        <w:t>不同智能体只接收完成当前任务所需的信息；</w:t>
-      </w:r>
-    </w:p>
-    <w:p>
-      <w:pPr>
-        <w:numPr>
-          <w:ilvl w:val="0"/>
-          <w:numId w:val="1"/>
-        </w:numPr>
-        <w:rPr>
-          <w:rFonts w:hint="eastAsia"/>
-        </w:rPr>
-      </w:pPr>
-      <w:r>
-        <w:t>信息必须携带事实、证据、不确定性和约束；</w:t>
-      </w:r>
-    </w:p>
-    <w:p>
-      <w:pPr>
-        <w:numPr>
-          <w:ilvl w:val="0"/>
-          <w:numId w:val="1"/>
-        </w:numPr>
-        <w:rPr>
-          <w:rFonts w:hint="eastAsia"/>
-        </w:rPr>
-      </w:pPr>
-      <w:r>
-        <w:t>审核失败后可以定位到主张、证据、智能体和步骤；</w:t>
-      </w:r>
-    </w:p>
-    <w:p>
-      <w:pPr>
-        <w:numPr>
-          <w:ilvl w:val="0"/>
-          <w:numId w:val="1"/>
-        </w:numPr>
-        <w:rPr>
-          <w:rFonts w:hint="eastAsia"/>
-        </w:rPr>
-      </w:pPr>
-      <w:r>
-        <w:t>只重跑出错部分，不破坏已经确认的结果；</w:t>
-      </w:r>
-    </w:p>
-    <w:p>
-      <w:pPr>
-        <w:numPr>
-          <w:ilvl w:val="0"/>
-          <w:numId w:val="1"/>
-        </w:numPr>
-        <w:rPr>
-          <w:rFonts w:hint="eastAsia"/>
-        </w:rPr>
-      </w:pPr>
-      <w:r>
-        <w:t>形成“任务分解—证据检索—专家生成—审核—局部修复”的闭环。</w:t>
-      </w:r>
-    </w:p>
-    <w:p>
-      <w:pPr>
-        <w:rPr>
-          <w:rFonts w:hint="eastAsia"/>
-        </w:rPr>
-      </w:pPr>
-      <w:r>
-        <w:t>创新对象不是“通信”，而是：</w:t>
-      </w:r>
-    </w:p>
-    <w:p>
-      <w:pPr>
-        <w:rPr>
-          <w:rFonts w:hint="eastAsia"/>
-        </w:rPr>
-      </w:pPr>
-      <w:r>
-        <w:rPr>
-          <w:b/>
-          <w:bCs/>
-        </w:rPr>
-        <w:t>面向教育场景的可信协作和错误责任链。</w:t>
-      </w:r>
-    </w:p>
-    <w:p>
-      <w:pPr>
-        <w:rPr>
-          <w:rFonts w:hint="eastAsia"/>
-        </w:rPr>
-      </w:pPr>
-      <w:r>
-        <w:pict w14:anchorId="5F7056EC">
-          <v:rect id="_x0000_i1025" style="width:0;height:1.5pt" o:hralign="center" o:hrstd="t" o:hr="t" fillcolor="#a0a0a0" stroked="f"/>
-        </w:pict>
-      </w:r>
-    </w:p>
-    <w:p>
-      <w:pPr>
-        <w:rPr>
-          <w:rFonts w:hint="eastAsia"/>
-          <w:b/>
-          <w:bCs/>
-        </w:rPr>
-      </w:pPr>
-      <w:r>
-        <w:rPr>
+        <w:ind w:left="720" w:hanging="360"/>
+        <w:rPr>
+          <w:rFonts w:hint="eastAsia"/>
+        </w:rPr>
+      </w:pPr>
+      <w:r>
+        <w:rPr>
+          <w:rFonts w:cs="等线"/>
+        </w:rPr>
+        <w:t>1. 不同智能体只接收完成当前任务所需的信息；</w:t>
+      </w:r>
+    </w:p>
+    <w:p>
+      <w:pPr>
+        <w:ind w:left="720" w:hanging="360"/>
+        <w:rPr>
+          <w:rFonts w:hint="eastAsia"/>
+        </w:rPr>
+      </w:pPr>
+      <w:r>
+        <w:rPr>
+          <w:rFonts w:cs="等线"/>
+        </w:rPr>
+        <w:t>2. 信息必须携带事实、证据、不确定性和约束；</w:t>
+      </w:r>
+    </w:p>
+    <w:p>
+      <w:pPr>
+        <w:ind w:left="720" w:hanging="360"/>
+        <w:rPr>
+          <w:rFonts w:hint="eastAsia"/>
+        </w:rPr>
+      </w:pPr>
+      <w:r>
+        <w:rPr>
+          <w:rFonts w:cs="等线"/>
+        </w:rPr>
+        <w:t>3. 审核失败后可以定位到主张、证据、智能体和步骤；</w:t>
+      </w:r>
+    </w:p>
+    <w:p>
+      <w:pPr>
+        <w:ind w:left="720" w:hanging="360"/>
+        <w:rPr>
+          <w:rFonts w:hint="eastAsia"/>
+        </w:rPr>
+      </w:pPr>
+      <w:r>
+        <w:rPr>
+          <w:rFonts w:cs="等线"/>
+        </w:rPr>
+        <w:t>4. 只重跑出错部分，不破坏已经确认的结果；</w:t>
+      </w:r>
+    </w:p>
+    <w:p>
+      <w:pPr>
+        <w:ind w:left="720" w:hanging="360"/>
+        <w:rPr>
+          <w:rFonts w:hint="eastAsia"/>
+        </w:rPr>
+      </w:pPr>
+      <w:r>
+        <w:rPr>
+          <w:rFonts w:cs="等线"/>
+        </w:rPr>
+        <w:t>5. 形成“任务分解—证据检索—专家生成—审核—局部修复”的闭环。</w:t>
+      </w:r>
+    </w:p>
+    <w:p>
+      <w:pPr>
+        <w:rPr>
+          <w:rFonts w:hint="eastAsia"/>
+          <w:b/>
+          <w:bCs/>
+        </w:rPr>
+      </w:pPr>
+      <w:r>
+        <w:rPr>
+          <w:rFonts w:hint="eastAsia"/>
+          <w:b/>
+          <w:bCs/>
+        </w:rPr>
+        <w:t>各个智能体只需要各司其职，各智能体通信过程中的信息要包含能够追溯到各个环节</w:t>
+      </w:r>
+    </w:p>
+    <w:p>
+      <w:pPr>
+        <w:rPr>
+          <w:rFonts w:hint="eastAsia"/>
+        </w:rPr>
+      </w:pPr>
+      <w:proofErr w:type="spellStart"/>
+      <w:r>
+        <w:rPr>
+          <w:rFonts w:hint="eastAsia"/>
+        </w:rPr>
+        <w:t>LangGraph</w:t>
+      </w:r>
+      <w:proofErr w:type="spellEnd"/>
+      <w:r>
+        <w:rPr>
+          <w:rFonts w:hint="eastAsia"/>
+        </w:rPr>
+        <w:t>，每个智能体的各项任务都以Skill的形式打包，针对特定任务，使用特定Skill，比如学习路径规划，知识点讲解等</w:t>
+      </w:r>
+    </w:p>
+    <w:p>
+      <w:pPr>
+        <w:rPr>
+          <w:rFonts w:hint="eastAsia"/>
+          <w:b/>
+          <w:bCs/>
+        </w:rPr>
+      </w:pPr>
+      <w:r>
+        <w:rPr>
+          <w:rFonts w:hint="eastAsia"/>
+          <w:b/>
+          <w:bCs/>
+        </w:rPr>
+        <w:t>重点说明多智能体规划的可解释性和可控性</w:t>
+      </w:r>
+    </w:p>
+    <w:p/>
+    <w:p>
+      <w:pPr>
+        <w:rPr>
+          <w:rFonts w:hint="eastAsia"/>
+        </w:rPr>
+      </w:pPr>
+    </w:p>
+    <w:p>
+      <w:pPr>
+        <w:rPr>
+          <w:rFonts w:hint="eastAsia"/>
+          <w:b/>
+          <w:bCs/>
+        </w:rPr>
+      </w:pPr>
+      <w:r>
+        <w:rPr>
+          <w:rFonts w:cs="等线"/>
           <w:b/>
           <w:bCs/>
         </w:rPr>
@@ -181,17 +222,8 @@
         </w:rPr>
       </w:pPr>
       <w:r>
-        <w:t>建议标题：</w:t>
-      </w:r>
-    </w:p>
-    <w:p>
-      <w:pPr>
-        <w:rPr>
-          <w:rFonts w:hint="eastAsia"/>
-        </w:rPr>
-      </w:pPr>
-      <w:r>
-        <w:rPr>
+        <w:rPr>
+          <w:rFonts w:cs="等线"/>
           <w:b/>
           <w:bCs/>
         </w:rPr>
@@ -205,104 +237,113 @@
         </w:rPr>
       </w:pPr>
       <w:r>
+        <w:rPr>
+          <w:rFonts w:cs="等线"/>
+        </w:rPr>
         <w:t>核心内容：</w:t>
       </w:r>
     </w:p>
     <w:p>
       <w:pPr>
-        <w:numPr>
-          <w:ilvl w:val="0"/>
-          <w:numId w:val="2"/>
-        </w:numPr>
-        <w:rPr>
-          <w:rFonts w:hint="eastAsia"/>
-        </w:rPr>
-      </w:pPr>
-      <w:r>
+        <w:ind w:left="720" w:hanging="360"/>
+        <w:rPr>
+          <w:rFonts w:hint="eastAsia"/>
+        </w:rPr>
+      </w:pPr>
+      <w:r>
+        <w:rPr>
+          <w:rFonts w:cs="等线"/>
+        </w:rPr>
         <w:t>宏观层：考试目标、阶段、教材和知识体系；</w:t>
       </w:r>
     </w:p>
     <w:p>
       <w:pPr>
-        <w:numPr>
-          <w:ilvl w:val="0"/>
-          <w:numId w:val="2"/>
-        </w:numPr>
-        <w:rPr>
-          <w:rFonts w:hint="eastAsia"/>
-        </w:rPr>
-      </w:pPr>
-      <w:r>
+        <w:ind w:left="720" w:hanging="360"/>
+        <w:rPr>
+          <w:rFonts w:hint="eastAsia"/>
+        </w:rPr>
+      </w:pPr>
+      <w:r>
+        <w:rPr>
+          <w:rFonts w:cs="等线"/>
+        </w:rPr>
         <w:t>中观层：周计划、短期目标、薄弱知识点和复习任务；</w:t>
       </w:r>
     </w:p>
     <w:p>
       <w:pPr>
-        <w:numPr>
-          <w:ilvl w:val="0"/>
-          <w:numId w:val="2"/>
-        </w:numPr>
-        <w:rPr>
-          <w:rFonts w:hint="eastAsia"/>
-        </w:rPr>
-      </w:pPr>
-      <w:r>
+        <w:ind w:left="720" w:hanging="360"/>
+        <w:rPr>
+          <w:rFonts w:hint="eastAsia"/>
+        </w:rPr>
+      </w:pPr>
+      <w:r>
+        <w:rPr>
+          <w:rFonts w:cs="等线"/>
+        </w:rPr>
         <w:t>微观层：近期答题、响应时间、连续错误和掌握变化；</w:t>
       </w:r>
     </w:p>
     <w:p>
       <w:pPr>
-        <w:numPr>
-          <w:ilvl w:val="0"/>
-          <w:numId w:val="2"/>
-        </w:numPr>
-        <w:rPr>
-          <w:rFonts w:hint="eastAsia"/>
-        </w:rPr>
-      </w:pPr>
-      <w:r>
+        <w:ind w:left="720" w:hanging="360"/>
+        <w:rPr>
+          <w:rFonts w:hint="eastAsia"/>
+        </w:rPr>
+      </w:pPr>
+      <w:r>
+        <w:rPr>
+          <w:rFonts w:cs="等线"/>
+        </w:rPr>
         <w:t>先检查前置知识、复习到期、可用时间、证据可信度等硬约束；</w:t>
       </w:r>
     </w:p>
     <w:p>
       <w:pPr>
-        <w:numPr>
-          <w:ilvl w:val="0"/>
-          <w:numId w:val="2"/>
-        </w:numPr>
-        <w:rPr>
-          <w:rFonts w:hint="eastAsia"/>
-        </w:rPr>
-      </w:pPr>
-      <w:r>
+        <w:ind w:left="720" w:hanging="360"/>
+        <w:rPr>
+          <w:rFonts w:hint="eastAsia"/>
+        </w:rPr>
+      </w:pPr>
+      <w:r>
+        <w:rPr>
+          <w:rFonts w:cs="等线"/>
+        </w:rPr>
         <w:t>再对候选任务进行透明评分；</w:t>
       </w:r>
     </w:p>
     <w:p>
       <w:pPr>
-        <w:numPr>
-          <w:ilvl w:val="0"/>
-          <w:numId w:val="2"/>
-        </w:numPr>
-        <w:rPr>
-          <w:rFonts w:hint="eastAsia"/>
-        </w:rPr>
-      </w:pPr>
-      <w:r>
-        <w:t>数据不足时降低推荐风险，不把模型猜测伪装成确定结论；</w:t>
-      </w:r>
-    </w:p>
-    <w:p>
-      <w:pPr>
-        <w:numPr>
-          <w:ilvl w:val="0"/>
-          <w:numId w:val="2"/>
-        </w:numPr>
-        <w:rPr>
-          <w:rFonts w:hint="eastAsia"/>
-        </w:rPr>
-      </w:pPr>
-      <w:r>
+        <w:ind w:left="720" w:hanging="360"/>
+        <w:rPr>
+          <w:rFonts w:hint="eastAsia"/>
+        </w:rPr>
+      </w:pPr>
+      <w:r>
+        <w:rPr>
+          <w:rFonts w:cs="等线"/>
+        </w:rPr>
+        <w:t>数据不足时降低推荐风险，</w:t>
+      </w:r>
+      <w:r>
+        <w:rPr>
+          <w:rFonts w:cs="等线" w:hint="eastAsia"/>
+        </w:rPr>
+        <w:t>以系统提供的经典路径为准；</w:t>
+      </w:r>
+    </w:p>
+    <w:p>
+      <w:pPr>
+        <w:ind w:left="720" w:hanging="360"/>
+        <w:rPr>
+          <w:rFonts w:hint="eastAsia"/>
+        </w:rPr>
+      </w:pPr>
+      <w:r>
+        <w:rPr>
+          <w:rFonts w:cs="等线"/>
+        </w:rPr>
         <w:t>上层计划变化后，向下传播版本和失效关系。</w:t>
       </w:r>
     </w:p>
@@ -313,17 +354,8 @@
         </w:rPr>
       </w:pPr>
       <w:r>
-        <w:t>这个点的技术贡献是：</w:t>
-      </w:r>
-    </w:p>
-    <w:p>
-      <w:pPr>
-        <w:rPr>
-          <w:rFonts w:hint="eastAsia"/>
-        </w:rPr>
-      </w:pPr>
-      <w:r>
-        <w:rPr>
+        <w:rPr>
+          <w:rFonts w:cs="等线"/>
           <w:b/>
           <w:bCs/>
         </w:rPr>
@@ -336,33 +368,27 @@
           <w:rFonts w:hint="eastAsia"/>
         </w:rPr>
       </w:pPr>
-      <w:r>
-        <w:t>不要只说“推荐下一个知识点”。</w:t>
-      </w:r>
-    </w:p>
-    <w:p>
-      <w:pPr>
-        <w:rPr>
-          <w:rFonts w:hint="eastAsia"/>
-        </w:rPr>
-      </w:pPr>
-      <w:r>
-        <w:lastRenderedPageBreak/>
-        <w:pict w14:anchorId="73C38E39">
-          <v:rect id="_x0000_i1026" style="width:0;height:1.5pt" o:hralign="center" o:hrstd="t" o:hr="t" fillcolor="#a0a0a0" stroked="f"/>
-        </w:pict>
-      </w:r>
-    </w:p>
-    <w:p>
-      <w:pPr>
-        <w:rPr>
-          <w:rFonts w:hint="eastAsia"/>
-          <w:b/>
-          <w:bCs/>
-        </w:rPr>
-      </w:pPr>
-      <w:r>
-        <w:rPr>
+    </w:p>
+    <w:p/>
+    <w:p/>
+    <w:p>
+      <w:pPr>
+        <w:rPr>
+          <w:rFonts w:hint="eastAsia"/>
+        </w:rPr>
+      </w:pPr>
+    </w:p>
+    <w:p>
+      <w:pPr>
+        <w:rPr>
+          <w:rFonts w:hint="eastAsia"/>
+          <w:b/>
+          <w:bCs/>
+        </w:rPr>
+      </w:pPr>
+      <w:r>
+        <w:rPr>
+          <w:rFonts w:cs="等线"/>
           <w:b/>
           <w:bCs/>
         </w:rPr>
@@ -376,17 +402,8 @@
         </w:rPr>
       </w:pPr>
       <w:r>
-        <w:t>建议标题：</w:t>
-      </w:r>
-    </w:p>
-    <w:p>
-      <w:pPr>
-        <w:rPr>
-          <w:rFonts w:hint="eastAsia"/>
-        </w:rPr>
-      </w:pPr>
-      <w:r>
-        <w:rPr>
+        <w:rPr>
+          <w:rFonts w:cs="等线"/>
           <w:b/>
           <w:bCs/>
         </w:rPr>
@@ -400,90 +417,93 @@
         </w:rPr>
       </w:pPr>
       <w:r>
+        <w:rPr>
+          <w:rFonts w:cs="等线"/>
+        </w:rPr>
         <w:t>核心内容：</w:t>
       </w:r>
     </w:p>
     <w:p>
       <w:pPr>
-        <w:numPr>
-          <w:ilvl w:val="0"/>
-          <w:numId w:val="3"/>
-        </w:numPr>
-        <w:rPr>
-          <w:rFonts w:hint="eastAsia"/>
-        </w:rPr>
-      </w:pPr>
-      <w:r>
+        <w:ind w:left="720" w:hanging="360"/>
+        <w:rPr>
+          <w:rFonts w:hint="eastAsia"/>
+        </w:rPr>
+      </w:pPr>
+      <w:r>
+        <w:rPr>
+          <w:rFonts w:cs="等线"/>
+        </w:rPr>
         <w:t>学习前：学生确认目标、时间预算、基础和信心；</w:t>
       </w:r>
     </w:p>
     <w:p>
       <w:pPr>
-        <w:numPr>
-          <w:ilvl w:val="0"/>
-          <w:numId w:val="3"/>
-        </w:numPr>
-        <w:rPr>
-          <w:rFonts w:hint="eastAsia"/>
-        </w:rPr>
-      </w:pPr>
-      <w:r>
+        <w:ind w:left="720" w:hanging="360"/>
+        <w:rPr>
+          <w:rFonts w:hint="eastAsia"/>
+        </w:rPr>
+      </w:pPr>
+      <w:r>
+        <w:rPr>
+          <w:rFonts w:cs="等线"/>
+        </w:rPr>
         <w:t>学习中：学生可以接受、修改、降难、换资源或请求帮助；</w:t>
       </w:r>
     </w:p>
     <w:p>
       <w:pPr>
-        <w:numPr>
-          <w:ilvl w:val="0"/>
-          <w:numId w:val="3"/>
-        </w:numPr>
-        <w:rPr>
-          <w:rFonts w:hint="eastAsia"/>
-        </w:rPr>
-      </w:pPr>
-      <w:r>
+        <w:ind w:left="720" w:hanging="360"/>
+        <w:rPr>
+          <w:rFonts w:hint="eastAsia"/>
+        </w:rPr>
+      </w:pPr>
+      <w:r>
+        <w:rPr>
+          <w:rFonts w:cs="等线"/>
+        </w:rPr>
         <w:t>学习后：学生评价任务的难度、有效性和相关性；</w:t>
       </w:r>
     </w:p>
     <w:p>
       <w:pPr>
-        <w:numPr>
-          <w:ilvl w:val="0"/>
-          <w:numId w:val="3"/>
-        </w:numPr>
-        <w:rPr>
-          <w:rFonts w:hint="eastAsia"/>
-        </w:rPr>
-      </w:pPr>
-      <w:r>
+        <w:ind w:left="720" w:hanging="360"/>
+        <w:rPr>
+          <w:rFonts w:hint="eastAsia"/>
+        </w:rPr>
+      </w:pPr>
+      <w:r>
+        <w:rPr>
+          <w:rFonts w:cs="等线"/>
+        </w:rPr>
         <w:t>系统展示“为什么推荐、依据哪些数据、影响哪个计划节点”；</w:t>
       </w:r>
     </w:p>
     <w:p>
       <w:pPr>
-        <w:numPr>
-          <w:ilvl w:val="0"/>
-          <w:numId w:val="3"/>
-        </w:numPr>
-        <w:rPr>
-          <w:rFonts w:hint="eastAsia"/>
-        </w:rPr>
-      </w:pPr>
-      <w:r>
+        <w:ind w:left="720" w:hanging="360"/>
+        <w:rPr>
+          <w:rFonts w:hint="eastAsia"/>
+        </w:rPr>
+      </w:pPr>
+      <w:r>
+        <w:rPr>
+          <w:rFonts w:cs="等线"/>
+        </w:rPr>
         <w:t>将学生反馈与实际答题、完成率、掌握度和复习效果联合起来；</w:t>
       </w:r>
     </w:p>
     <w:p>
       <w:pPr>
-        <w:numPr>
-          <w:ilvl w:val="0"/>
-          <w:numId w:val="3"/>
-        </w:numPr>
-        <w:rPr>
-          <w:rFonts w:hint="eastAsia"/>
-        </w:rPr>
-      </w:pPr>
-      <w:r>
+        <w:ind w:left="720" w:hanging="360"/>
+        <w:rPr>
+          <w:rFonts w:hint="eastAsia"/>
+        </w:rPr>
+      </w:pPr>
+      <w:r>
+        <w:rPr>
+          <w:rFonts w:cs="等线"/>
+        </w:rPr>
         <w:t>反馈结果进入下一轮路径生成和资源匹配。</w:t>
       </w:r>
     </w:p>
@@ -494,17 +514,8 @@
         </w:rPr>
       </w:pPr>
       <w:r>
-        <w:t>这个点的创新对象不是“可解释界面”，而是：</w:t>
-      </w:r>
-    </w:p>
-    <w:p>
-      <w:pPr>
-        <w:rPr>
-          <w:rFonts w:hint="eastAsia"/>
-        </w:rPr>
-      </w:pPr>
-      <w:r>
-        <w:rPr>
+        <w:rPr>
+          <w:rFonts w:cs="等线"/>
           <w:b/>
           <w:bCs/>
         </w:rPr>
@@ -519,522 +530,253 @@
           <w:bCs/>
         </w:rPr>
       </w:pPr>
-      <w:r>
-        <w:rPr>
-          <w:b/>
-          <w:bCs/>
-        </w:rPr>
-        <w:t>建议重写后的三个创新点</w:t>
-      </w:r>
-    </w:p>
-    <w:p>
-      <w:pPr>
-        <w:rPr>
-          <w:rFonts w:hint="eastAsia"/>
-          <w:b/>
-          <w:bCs/>
-        </w:rPr>
-      </w:pPr>
-      <w:r>
-        <w:rPr>
-          <w:b/>
-          <w:bCs/>
-        </w:rPr>
-        <w:t>创新点一：可信、可追责的多智能体学习任务协同机制</w:t>
-      </w:r>
-    </w:p>
-    <w:p>
-      <w:pPr>
-        <w:rPr>
-          <w:rFonts w:hint="eastAsia"/>
-        </w:rPr>
-      </w:pPr>
-      <w:r>
-        <w:t>建议标题：</w:t>
-      </w:r>
-    </w:p>
-    <w:p>
-      <w:pPr>
-        <w:rPr>
-          <w:rFonts w:hint="eastAsia"/>
-        </w:rPr>
-      </w:pPr>
-      <w:r>
-        <w:rPr>
-          <w:b/>
-          <w:bCs/>
-        </w:rPr>
-        <w:t>面向学习任务的证据约束多智能体协同与局部修复机制</w:t>
-      </w:r>
-    </w:p>
-    <w:p>
-      <w:pPr>
-        <w:rPr>
-          <w:rFonts w:hint="eastAsia"/>
-        </w:rPr>
-      </w:pPr>
-      <w:r>
-        <w:t>核心内容：</w:t>
-      </w:r>
-    </w:p>
-    <w:p>
-      <w:pPr>
-        <w:numPr>
-          <w:ilvl w:val="0"/>
-          <w:numId w:val="4"/>
-        </w:numPr>
-        <w:rPr>
-          <w:rFonts w:hint="eastAsia"/>
-        </w:rPr>
-      </w:pPr>
-      <w:r>
-        <w:t>不同智能体只接收完成当前任务所需的信息；</w:t>
-      </w:r>
-    </w:p>
-    <w:p>
-      <w:pPr>
-        <w:numPr>
-          <w:ilvl w:val="0"/>
-          <w:numId w:val="4"/>
-        </w:numPr>
-        <w:rPr>
-          <w:rFonts w:hint="eastAsia"/>
-        </w:rPr>
-      </w:pPr>
-      <w:r>
-        <w:t>信息必须携带事实、证据、不确定性和约束；</w:t>
-      </w:r>
-    </w:p>
-    <w:p>
-      <w:pPr>
-        <w:numPr>
-          <w:ilvl w:val="0"/>
-          <w:numId w:val="4"/>
-        </w:numPr>
-        <w:rPr>
-          <w:rFonts w:hint="eastAsia"/>
-        </w:rPr>
-      </w:pPr>
-      <w:r>
-        <w:t>审核失败后可以定位到主张、证据、智能体和步骤；</w:t>
-      </w:r>
-    </w:p>
-    <w:p>
-      <w:pPr>
-        <w:numPr>
-          <w:ilvl w:val="0"/>
-          <w:numId w:val="4"/>
-        </w:numPr>
-        <w:rPr>
-          <w:rFonts w:hint="eastAsia"/>
-        </w:rPr>
-      </w:pPr>
-      <w:r>
-        <w:t>只重跑出错部分，不破坏已经确认的结果；</w:t>
-      </w:r>
-    </w:p>
-    <w:p>
-      <w:pPr>
-        <w:numPr>
-          <w:ilvl w:val="0"/>
-          <w:numId w:val="4"/>
-        </w:numPr>
-        <w:rPr>
-          <w:rFonts w:hint="eastAsia"/>
-        </w:rPr>
-      </w:pPr>
-      <w:r>
-        <w:t>形成“任务分解—证据检索—专家生成—审核—局部修复”的闭环。</w:t>
-      </w:r>
-    </w:p>
-    <w:p>
-      <w:pPr>
-        <w:rPr>
-          <w:rFonts w:hint="eastAsia"/>
-        </w:rPr>
-      </w:pPr>
-      <w:r>
-        <w:t>创新对象不是“通信”，而是：</w:t>
-      </w:r>
-    </w:p>
-    <w:p>
-      <w:pPr>
-        <w:rPr>
-          <w:rFonts w:hint="eastAsia"/>
-        </w:rPr>
-      </w:pPr>
-      <w:r>
-        <w:rPr>
-          <w:b/>
-          <w:bCs/>
-        </w:rPr>
-        <w:t>面向教育场景的可信协作和错误责任链。</w:t>
-      </w:r>
-    </w:p>
-    <w:p>
-      <w:pPr>
-        <w:rPr>
-          <w:rFonts w:hint="eastAsia"/>
-        </w:rPr>
-      </w:pPr>
-      <w:r>
-        <w:pict w14:anchorId="6BE8E2EA">
-          <v:rect id="_x0000_i1027" style="width:0;height:1.5pt" o:hralign="center" o:hrstd="t" o:hr="t" fillcolor="#a0a0a0" stroked="f"/>
-        </w:pict>
-      </w:r>
-    </w:p>
-    <w:p>
-      <w:pPr>
-        <w:rPr>
-          <w:rFonts w:hint="eastAsia"/>
-          <w:b/>
-          <w:bCs/>
-        </w:rPr>
-      </w:pPr>
-      <w:r>
-        <w:rPr>
-          <w:b/>
-          <w:bCs/>
-        </w:rPr>
-        <w:t>创新点二：安全约束下的多时间尺度学习路径生成机制</w:t>
-      </w:r>
-    </w:p>
-    <w:p>
-      <w:pPr>
-        <w:rPr>
-          <w:rFonts w:hint="eastAsia"/>
-        </w:rPr>
-      </w:pPr>
-      <w:r>
-        <w:lastRenderedPageBreak/>
-        <w:t>建议标题：</w:t>
-      </w:r>
-    </w:p>
-    <w:p>
-      <w:pPr>
-        <w:rPr>
-          <w:rFonts w:hint="eastAsia"/>
-        </w:rPr>
-      </w:pPr>
-      <w:r>
-        <w:rPr>
-          <w:b/>
-          <w:bCs/>
-        </w:rPr>
-        <w:t>融合领域知识先验与多时间尺度学情的安全学习路径生成机制</w:t>
-      </w:r>
-    </w:p>
-    <w:p>
-      <w:pPr>
-        <w:rPr>
-          <w:rFonts w:hint="eastAsia"/>
-        </w:rPr>
-      </w:pPr>
-      <w:r>
-        <w:t>核心内容：</w:t>
-      </w:r>
-    </w:p>
-    <w:p>
-      <w:pPr>
-        <w:numPr>
-          <w:ilvl w:val="0"/>
-          <w:numId w:val="5"/>
-        </w:numPr>
-        <w:rPr>
-          <w:rFonts w:hint="eastAsia"/>
-        </w:rPr>
-      </w:pPr>
-      <w:r>
-        <w:t>宏观层：考试目标、阶段、教材和知识体系；</w:t>
-      </w:r>
-    </w:p>
-    <w:p>
-      <w:pPr>
-        <w:numPr>
-          <w:ilvl w:val="0"/>
-          <w:numId w:val="5"/>
-        </w:numPr>
-        <w:rPr>
-          <w:rFonts w:hint="eastAsia"/>
-        </w:rPr>
-      </w:pPr>
-      <w:r>
-        <w:t>中观层：周计划、短期目标、薄弱知识点和复习任务；</w:t>
-      </w:r>
-    </w:p>
-    <w:p>
-      <w:pPr>
-        <w:numPr>
-          <w:ilvl w:val="0"/>
-          <w:numId w:val="5"/>
-        </w:numPr>
-        <w:rPr>
-          <w:rFonts w:hint="eastAsia"/>
-        </w:rPr>
-      </w:pPr>
-      <w:r>
-        <w:t>微观层：近期答题、响应时间、连续错误和掌握变化；</w:t>
-      </w:r>
-    </w:p>
-    <w:p>
-      <w:pPr>
-        <w:numPr>
-          <w:ilvl w:val="0"/>
-          <w:numId w:val="5"/>
-        </w:numPr>
-        <w:rPr>
-          <w:rFonts w:hint="eastAsia"/>
-        </w:rPr>
-      </w:pPr>
-      <w:r>
-        <w:t>先检查前置知识、复习到期、可用时间、证据可信度等硬约束；</w:t>
-      </w:r>
-    </w:p>
-    <w:p>
-      <w:pPr>
-        <w:numPr>
-          <w:ilvl w:val="0"/>
-          <w:numId w:val="5"/>
-        </w:numPr>
-        <w:rPr>
-          <w:rFonts w:hint="eastAsia"/>
-        </w:rPr>
-      </w:pPr>
-      <w:r>
-        <w:t>再对候选任务进行透明评分；</w:t>
-      </w:r>
-    </w:p>
-    <w:p>
-      <w:pPr>
-        <w:numPr>
-          <w:ilvl w:val="0"/>
-          <w:numId w:val="5"/>
-        </w:numPr>
-        <w:rPr>
-          <w:rFonts w:hint="eastAsia"/>
-        </w:rPr>
-      </w:pPr>
-      <w:r>
-        <w:t>数据不足时降低推荐风险，不把模型猜测伪装成确定结论；</w:t>
-      </w:r>
-    </w:p>
-    <w:p>
-      <w:pPr>
-        <w:numPr>
-          <w:ilvl w:val="0"/>
-          <w:numId w:val="5"/>
-        </w:numPr>
-        <w:rPr>
-          <w:rFonts w:hint="eastAsia"/>
-        </w:rPr>
-      </w:pPr>
-      <w:r>
-        <w:t>上层计划变化后，向下传播版本和失效关系。</w:t>
-      </w:r>
-    </w:p>
-    <w:p>
-      <w:pPr>
-        <w:rPr>
-          <w:rFonts w:hint="eastAsia"/>
-        </w:rPr>
-      </w:pPr>
-      <w:r>
-        <w:t>这个点的技术贡献是：</w:t>
-      </w:r>
-    </w:p>
-    <w:p>
-      <w:pPr>
-        <w:rPr>
-          <w:rFonts w:hint="eastAsia"/>
-        </w:rPr>
-      </w:pPr>
-      <w:r>
-        <w:rPr>
-          <w:b/>
-          <w:bCs/>
-        </w:rPr>
-        <w:t>把“规划、推荐、复习、答题反馈”统一到一个有层级、有约束、有状态版本的路径系统中。</w:t>
-      </w:r>
-    </w:p>
-    <w:p>
-      <w:pPr>
-        <w:rPr>
-          <w:rFonts w:hint="eastAsia"/>
-        </w:rPr>
-      </w:pPr>
-      <w:r>
-        <w:t>不要只说“推荐下一个知识点”。</w:t>
-      </w:r>
-    </w:p>
-    <w:p>
-      <w:pPr>
-        <w:rPr>
-          <w:rFonts w:hint="eastAsia"/>
-        </w:rPr>
-      </w:pPr>
-      <w:r>
-        <w:pict w14:anchorId="60561854">
-          <v:rect id="_x0000_i1028" style="width:0;height:1.5pt" o:hralign="center" o:hrstd="t" o:hr="t" fillcolor="#a0a0a0" stroked="f"/>
-        </w:pict>
-      </w:r>
-    </w:p>
-    <w:p>
-      <w:pPr>
-        <w:rPr>
-          <w:rFonts w:hint="eastAsia"/>
-          <w:b/>
-          <w:bCs/>
-        </w:rPr>
-      </w:pPr>
-      <w:r>
-        <w:rPr>
-          <w:b/>
-          <w:bCs/>
-        </w:rPr>
-        <w:t>创新点三：学生参与的可解释学习决策闭环</w:t>
-      </w:r>
-    </w:p>
-    <w:p>
-      <w:pPr>
-        <w:rPr>
-          <w:rFonts w:hint="eastAsia"/>
-        </w:rPr>
-      </w:pPr>
-      <w:r>
-        <w:t>建议标题：</w:t>
-      </w:r>
-    </w:p>
-    <w:p>
-      <w:pPr>
-        <w:rPr>
-          <w:rFonts w:hint="eastAsia"/>
-        </w:rPr>
-      </w:pPr>
-      <w:r>
-        <w:rPr>
-          <w:b/>
-          <w:bCs/>
-        </w:rPr>
-        <w:t>学生参与的可解释学习决策与效果反馈闭环</w:t>
-      </w:r>
-    </w:p>
-    <w:p>
-      <w:pPr>
-        <w:rPr>
-          <w:rFonts w:hint="eastAsia"/>
-        </w:rPr>
-      </w:pPr>
-      <w:r>
-        <w:t>核心内容：</w:t>
-      </w:r>
-    </w:p>
-    <w:p>
-      <w:pPr>
-        <w:numPr>
-          <w:ilvl w:val="0"/>
-          <w:numId w:val="6"/>
-        </w:numPr>
-        <w:rPr>
-          <w:rFonts w:hint="eastAsia"/>
-        </w:rPr>
-      </w:pPr>
-      <w:r>
-        <w:t>学习前：学生确认目标、时间预算、基础和信心；</w:t>
-      </w:r>
-    </w:p>
-    <w:p>
-      <w:pPr>
-        <w:numPr>
-          <w:ilvl w:val="0"/>
-          <w:numId w:val="6"/>
-        </w:numPr>
-        <w:rPr>
-          <w:rFonts w:hint="eastAsia"/>
-        </w:rPr>
-      </w:pPr>
-      <w:r>
-        <w:t>学习中：学生可以接受、修改、降难、换资源或请求帮助；</w:t>
-      </w:r>
-    </w:p>
-    <w:p>
-      <w:pPr>
-        <w:numPr>
-          <w:ilvl w:val="0"/>
-          <w:numId w:val="6"/>
-        </w:numPr>
-        <w:rPr>
-          <w:rFonts w:hint="eastAsia"/>
-        </w:rPr>
-      </w:pPr>
-      <w:r>
-        <w:t>学习后：学生评价任务的难度、有效性和相关性；</w:t>
-      </w:r>
-    </w:p>
-    <w:p>
-      <w:pPr>
-        <w:numPr>
-          <w:ilvl w:val="0"/>
-          <w:numId w:val="6"/>
-        </w:numPr>
-        <w:rPr>
-          <w:rFonts w:hint="eastAsia"/>
-        </w:rPr>
-      </w:pPr>
-      <w:r>
-        <w:t>系统展示“为什么推荐、依据哪些数据、影响哪个计划节点”；</w:t>
-      </w:r>
-    </w:p>
-    <w:p>
-      <w:pPr>
-        <w:numPr>
-          <w:ilvl w:val="0"/>
-          <w:numId w:val="6"/>
-        </w:numPr>
-        <w:rPr>
-          <w:rFonts w:hint="eastAsia"/>
-        </w:rPr>
-      </w:pPr>
-      <w:r>
-        <w:t>将学生反馈与实际答题、完成率、掌握度和复习效果联合起来；</w:t>
-      </w:r>
-    </w:p>
-    <w:p>
-      <w:pPr>
-        <w:numPr>
-          <w:ilvl w:val="0"/>
-          <w:numId w:val="6"/>
-        </w:numPr>
-        <w:rPr>
-          <w:rFonts w:hint="eastAsia"/>
-        </w:rPr>
-      </w:pPr>
-      <w:r>
-        <w:t>反馈结果进入下一轮路径生成和资源匹配。</w:t>
-      </w:r>
-    </w:p>
-    <w:p>
-      <w:pPr>
-        <w:rPr>
-          <w:rFonts w:hint="eastAsia"/>
-        </w:rPr>
-      </w:pPr>
-      <w:r>
-        <w:t>这个点的创新对象不是“可解释界面”，而是：</w:t>
-      </w:r>
-    </w:p>
-    <w:p>
-      <w:pPr>
-        <w:rPr>
-          <w:rFonts w:hint="eastAsia"/>
-        </w:rPr>
-      </w:pPr>
-      <w:r>
-        <w:rPr>
-          <w:b/>
-          <w:bCs/>
-        </w:rPr>
-        <w:t>把学生从被动接受推荐的人，变成学习路径调整的共同决策者。</w:t>
-      </w:r>
+    </w:p>
+    <w:p>
+      <w:pPr>
+        <w:rPr>
+          <w:rFonts w:hint="eastAsia"/>
+          <w:b/>
+          <w:bCs/>
+        </w:rPr>
+      </w:pPr>
+      <w:r>
+        <w:rPr>
+          <w:rFonts w:hint="eastAsia"/>
+          <w:b/>
+          <w:bCs/>
+        </w:rPr>
+        <w:t>第二要点就是平台可迁移性</w:t>
+      </w:r>
+      <w:r>
+        <w:rPr>
+          <w:rFonts w:hint="eastAsia"/>
+          <w:b/>
+          <w:bCs/>
+        </w:rPr>
+        <w:t>，包括导入各类考试资源</w:t>
+      </w:r>
+    </w:p>
+    <w:p/>
+    <w:p/>
+    <w:p/>
+    <w:p/>
+    <w:p>
+      <w:pPr>
+        <w:rPr>
+          <w:rFonts w:hint="eastAsia"/>
+        </w:rPr>
+      </w:pPr>
+    </w:p>
+    <w:p>
+      <w:pPr>
+        <w:rPr>
+          <w:rFonts w:hint="eastAsia"/>
+        </w:rPr>
+      </w:pPr>
+    </w:p>
+    <w:p>
+      <w:pPr>
+        <w:rPr>
+          <w:rFonts w:hint="eastAsia"/>
+        </w:rPr>
+      </w:pPr>
+    </w:p>
+    <w:p>
+      <w:pPr>
+        <w:rPr>
+          <w:rFonts w:hint="eastAsia"/>
+          <w:b/>
+          <w:bCs/>
+        </w:rPr>
+      </w:pPr>
+      <w:r>
+        <w:rPr>
+          <w:rFonts w:hint="eastAsia"/>
+          <w:b/>
+          <w:bCs/>
+        </w:rPr>
+        <w:t>重点突出某一个</w:t>
+      </w:r>
+      <w:r>
+        <w:rPr>
+          <w:rFonts w:hint="eastAsia"/>
+          <w:b/>
+          <w:bCs/>
+        </w:rPr>
+        <w:t>或者两个</w:t>
+      </w:r>
+      <w:r>
+        <w:rPr>
+          <w:rFonts w:hint="eastAsia"/>
+          <w:b/>
+          <w:bCs/>
+        </w:rPr>
+        <w:t>亮点，比如问题定位，内容可解释性</w:t>
+      </w:r>
+    </w:p>
+    <w:p>
+      <w:pPr>
+        <w:rPr>
+          <w:rFonts w:hint="eastAsia"/>
+          <w:b/>
+          <w:bCs/>
+        </w:rPr>
+      </w:pPr>
+      <w:r>
+        <w:rPr>
+          <w:rFonts w:hint="eastAsia"/>
+          <w:b/>
+          <w:bCs/>
+        </w:rPr>
+        <w:t>弱化工程描述</w:t>
+      </w:r>
+      <w:r>
+        <w:rPr>
+          <w:rFonts w:hint="eastAsia"/>
+          <w:b/>
+          <w:bCs/>
+        </w:rPr>
+        <w:t>，强调</w:t>
+      </w:r>
+      <w:r>
+        <w:rPr>
+          <w:rFonts w:hint="eastAsia"/>
+          <w:b/>
+          <w:bCs/>
+        </w:rPr>
+        <w:t>算法</w:t>
+      </w:r>
+      <w:r>
+        <w:rPr>
+          <w:rFonts w:hint="eastAsia"/>
+          <w:b/>
+          <w:bCs/>
+        </w:rPr>
+        <w:t>解决能力</w:t>
+      </w:r>
+      <w:r>
+        <w:rPr>
+          <w:rFonts w:hint="eastAsia"/>
+          <w:b/>
+          <w:bCs/>
+        </w:rPr>
+        <w:t>的能力</w:t>
+      </w:r>
+    </w:p>
+    <w:p>
+      <w:pPr>
+        <w:rPr>
+          <w:rFonts w:hint="eastAsia"/>
+          <w:b/>
+          <w:bCs/>
+        </w:rPr>
+      </w:pPr>
+      <w:r>
+        <w:rPr>
+          <w:rFonts w:hint="eastAsia"/>
+          <w:b/>
+          <w:bCs/>
+        </w:rPr>
+        <w:t>系统智能体化</w:t>
+      </w:r>
+    </w:p>
+    <w:p>
+      <w:pPr>
+        <w:rPr>
+          <w:rFonts w:hint="eastAsia"/>
+        </w:rPr>
+      </w:pPr>
+    </w:p>
+    <w:p>
+      <w:pPr>
+        <w:rPr>
+          <w:rFonts w:hint="eastAsia"/>
+        </w:rPr>
+      </w:pPr>
+    </w:p>
+    <w:p>
+      <w:pPr>
+        <w:rPr>
+          <w:rFonts w:hint="eastAsia"/>
+        </w:rPr>
+      </w:pPr>
+    </w:p>
+    <w:p>
+      <w:pPr>
+        <w:rPr>
+          <w:rFonts w:hint="eastAsia"/>
+        </w:rPr>
+      </w:pPr>
+    </w:p>
+    <w:p>
+      <w:pPr>
+        <w:rPr>
+          <w:rFonts w:hint="eastAsia"/>
+        </w:rPr>
+      </w:pPr>
+    </w:p>
+    <w:p>
+      <w:pPr>
+        <w:rPr>
+          <w:rFonts w:hint="eastAsia"/>
+        </w:rPr>
+      </w:pPr>
+    </w:p>
+    <w:p>
+      <w:r>
+        <w:rPr>
+          <w:rFonts w:hint="eastAsia"/>
+        </w:rPr>
+        <w:t>强化学习过程性奖励（智能体）</w:t>
+      </w:r>
+    </w:p>
+    <w:p>
+      <w:pPr>
+        <w:rPr>
+          <w:rFonts w:hint="eastAsia"/>
+        </w:rPr>
+      </w:pPr>
+      <w:r>
+        <w:rPr>
+          <w:rFonts w:hint="eastAsia"/>
+        </w:rPr>
+        <w:t>模型幻觉抑制</w:t>
+      </w:r>
+    </w:p>
+    <w:p>
+      <w:pPr>
+        <w:rPr>
+          <w:rFonts w:hint="eastAsia"/>
+        </w:rPr>
+      </w:pPr>
+    </w:p>
+    <w:p>
+      <w:pPr>
+        <w:rPr>
+          <w:rFonts w:hint="eastAsia"/>
+        </w:rPr>
+      </w:pPr>
+    </w:p>
+    <w:p>
+      <w:pPr>
+        <w:rPr>
+          <w:rFonts w:hint="eastAsia"/>
+        </w:rPr>
+      </w:pPr>
+    </w:p>
+    <w:p>
+      <w:pPr>
+        <w:rPr>
+          <w:rFonts w:hint="eastAsia"/>
+        </w:rPr>
+      </w:pPr>
+    </w:p>
+    <w:p>
+      <w:pPr>
+        <w:rPr>
+          <w:rFonts w:hint="eastAsia"/>
+        </w:rPr>
+      </w:pPr>
     </w:p>
     <w:p>
       <w:pPr>
@@ -1046,7 +788,7 @@
     <w:sectPr>
       <w:pgSz w:w="11906" w:h="16838"/>
       <w:pgMar w:top="1440" w:right="1800" w:bottom="1440" w:left="1800" w:header="851" w:footer="992" w:gutter="0"/>
-      <w:cols w:space="425"/>
+      <w:cols w:space="720"/>
       <w:docGrid w:type="lines" w:linePitch="312"/>
     </w:sectPr>
   </w:body>
@@ -1054,7 +796,7 @@
 </file>
 
 <file path=word/numbering.xml><?xml version="1.0" encoding="utf-8"?>
-<w:numbering xmlns:wpc="http://schemas.microsoft.com/office/word/2010/wordprocessingCanvas" xmlns:cx="http://schemas.microsoft.com/office/drawing/2014/chartex" xmlns:cx1="http://schemas.microsoft.com/office/drawing/2015/9/8/chartex" xmlns:cx2="http://schemas.microsoft.com/office/drawing/2015/10/21/chartex" xmlns:cx3="http://schemas.microsoft.com/office/drawing/2016/5/9/chartex" xmlns:cx4="http://schemas.microsoft.com/office/drawing/2016/5/10/chartex" xmlns:cx5="http://schemas.microsoft.com/office/drawing/2016/5/11/chartex" xmlns:cx6="http://schemas.microsoft.com/office/drawing/2016/5/12/chartex" xmlns:cx7="http://schemas.microsoft.com/office/drawing/2016/5/13/chartex" xmlns:cx8="http://schemas.microsoft.com/office/drawing/2016/5/14/chartex" xmlns:mc="http://schemas.openxmlformats.org/markup-compatibility/2006" xmlns:aink="http://schemas.microsoft.com/office/drawing/2016/ink" xmlns:am3d="http://schemas.microsoft.com/office/drawing/2017/model3d" xmlns:o="urn:schemas-microsoft-com:office:office" xmlns:oel="http://schemas.microsoft.com/office/2019/extlst" xmlns:r="http://schemas.openxmlformats.org/officeDocument/2006/relationships" xmlns:m="http://schemas.openxmlformats.org/officeDocument/2006/math" xmlns:v="urn:schemas-microsoft-com:vml" xmlns:wp14="http://schemas.microsoft.com/office/word/2010/wordprocessingDrawing" xmlns:wp="http://schemas.openxmlformats.org/drawingml/2006/wordprocessingDrawing" xmlns:w10="urn:schemas-microsoft-com:office:word" xmlns:w="http://schemas.openxmlformats.org/wordprocessingml/2006/main" xmlns:w14="http://schemas.microsoft.com/office/word/2010/wordml" xmlns:w15="http://schemas.microsoft.com/office/word/2012/wordml" xmlns:w16cex="http://schemas.microsoft.com/office/word/2018/wordml/cex" xmlns:w16cid="http://schemas.microsoft.com/office/word/2016/wordml/cid" xmlns:w16="http://schemas.microsoft.com/office/word/2018/wordml" xmlns:w16du="http://schemas.microsoft.com/office/word/2023/wordml/word16du" xmlns:w16sdtdh="http://schemas.microsoft.com/office/word/2020/wordml/sdtdatahash" xmlns:w16sdtfl="http://schemas.microsoft.com/office/word/2024/wordml/sdtformatlock" xmlns:w16se="http://schemas.microsoft.com/office/word/2015/wordml/symex" xmlns:wpg="http://schemas.microsoft.com/office/word/2010/wordprocessingGroup" xmlns:wpi="http://schemas.microsoft.com/office/word/2010/wordprocessingInk" xmlns:wne="http://schemas.microsoft.com/office/word/2006/wordml" xmlns:wps="http://schemas.microsoft.com/office/word/2010/wordprocessingShape" mc:Ignorable="w14 w15 w16se w16cid w16 w16cex w16sdtdh w16sdtfl w16du wp14">
+<w:numbering xmlns:wpc="http://schemas.microsoft.com/office/word/2010/wordprocessingCanvas" xmlns:cx="http://schemas.microsoft.com/office/drawing/2014/chartex" xmlns:cx1="http://schemas.microsoft.com/office/drawing/2015/9/8/chartex" xmlns:cx2="http://schemas.microsoft.com/office/drawing/2015/10/21/chartex" xmlns:cx3="http://schemas.microsoft.com/office/drawing/2016/5/9/chartex" xmlns:cx4="http://schemas.microsoft.com/office/drawing/2016/5/10/chartex" xmlns:cx5="http://schemas.microsoft.com/office/drawing/2016/5/11/chartex" xmlns:cx6="http://schemas.microsoft.com/office/drawing/2016/5/12/chartex" xmlns:cx7="http://schemas.microsoft.com/office/drawing/2016/5/13/chartex" xmlns:cx8="http://schemas.microsoft.com/office/drawing/2016/5/14/chartex" xmlns:mc="http://schemas.openxmlformats.org/markup-compatibility/2006" xmlns:aink="http://schemas.microsoft.com/office/drawing/2016/ink" xmlns:am3d="http://schemas.microsoft.com/office/drawing/2017/model3d" xmlns:o="urn:schemas-microsoft-com:office:office" xmlns:oel="http://schemas.microsoft.com/office/2019/extlst" xmlns:r="http://schemas.openxmlformats.org/officeDocument/2006/relationships" xmlns:m="http://schemas.openxmlformats.org/officeDocument/2006/math" xmlns:v="urn:schemas-microsoft-com:vml" xmlns:wp14="http://schemas.microsoft.com/office/word/2010/wordprocessingDrawing" xmlns:wp="http://schemas.openxmlformats.org/drawingml/2006/wordprocessingDrawing" xmlns:w10="urn:schemas-microsoft-com:office:word" xmlns:w="http://schemas.openxmlformats.org/wordprocessingml/2006/main" xmlns:w14="http://schemas.microsoft.com/office/word/2010/wordml" xmlns:w15="http://schemas.microsoft.com/office/word/2012/wordml" xmlns:w16cei="http://schemas.microsoft.com/office/word/2026/wordml/cei" xmlns:w16cex="http://schemas.microsoft.com/office/word/2018/wordml/cex" xmlns:w16cid="http://schemas.microsoft.com/office/word/2016/wordml/cid" xmlns:w16="http://schemas.microsoft.com/office/word/2018/wordml" xmlns:w16du="http://schemas.microsoft.com/office/word/2023/wordml/word16du" xmlns:w16sdtdh="http://schemas.microsoft.com/office/word/2020/wordml/sdtdatahash" xmlns:w16sdtfl="http://schemas.microsoft.com/office/word/2024/wordml/sdtformatlock" xmlns:w16se="http://schemas.microsoft.com/office/word/2015/wordml/symex" xmlns:wpg="http://schemas.microsoft.com/office/word/2010/wordprocessingGroup" xmlns:wpi="http://schemas.microsoft.com/office/word/2010/wordprocessingInk" xmlns:wne="http://schemas.microsoft.com/office/word/2006/wordml" xmlns:wps="http://schemas.microsoft.com/office/word/2010/wordprocessingShape" mc:Ignorable="w14 w15 w16se w16cid w16 w16cex w16sdtdh w16sdtfl w16du wp14">
   <w:abstractNum w:abstractNumId="0" w15:restartNumberingAfterBreak="0">
     <w:nsid w:val="0F723BC4"/>
     <w:multiLevelType w:val="multilevel"/>

</xml_diff>